<commit_message>
Pendientes: un pendiente nuevo parte sin checklist por defecto
El tipo por defecto de un pendiente nuevo era «Reprogramación Mantención
Preventiva», que armaba su checklist solo: al crear cualquier pendiente
aparecía una lista por defecto. Ahora:
- un pendiente NUEVO parte con tipo neutro «Otro» y SIN checklist;
- el checklist (protocolo o ciclo de reprogramación) aparece solo cuando
  el usuario ELIGE explícitamente ese tipo (manejador de #pe-tipo);
- al ABRIR un pendiente EXISTENTE de protocolo/reprogramación se sigue
  asegurando su checklist (respaldo histórico), sin cambios.

APP_BUILD 2026-06-16.39, versión autónoma y ENTENDIMIENTO actualizados.
</commit_message>
<xml_diff>
--- a/ENTENDIMIENTO.docx
+++ b/ENTENDIMIENTO.docx
@@ -102,7 +102,7 @@
         <w:rPr>
           <w:i/>
         </w:rPr>
-        <w:t>Última actualización: 2026-06-16 · App build 2026-06-16.38</w:t>
+        <w:t>Última actualización: 2026-06-16 · App build 2026-06-16.39</w:t>
       </w:r>
     </w:p>
     <w:p>
@@ -2483,6 +2483,68 @@
           </w:p>
         </w:tc>
       </w:tr>
+      <w:tr>
+        <w:tc>
+          <w:tcPr>
+            <w:tcW w:type="dxa" w:w="2880"/>
+          </w:tcPr>
+          <w:p>
+            <w:r/>
+            <w:r>
+              <w:t>2026-06-16</w:t>
+            </w:r>
+          </w:p>
+        </w:tc>
+        <w:tc>
+          <w:tcPr>
+            <w:tcW w:type="dxa" w:w="2880"/>
+          </w:tcPr>
+          <w:p>
+            <w:r/>
+            <w:r>
+              <w:t xml:space="preserve">Un </w:t>
+            </w:r>
+            <w:r>
+              <w:rPr>
+                <w:b/>
+              </w:rPr>
+              <w:t>pendiente nuevo</w:t>
+            </w:r>
+            <w:r>
+              <w:t xml:space="preserve"> parte </w:t>
+            </w:r>
+            <w:r>
+              <w:rPr>
+                <w:b/>
+              </w:rPr>
+              <w:t>limpio</w:t>
+            </w:r>
+            <w:r>
+              <w:t xml:space="preserve"> (tipo «Otro», sin checklist); el checklist aparece solo al </w:t>
+            </w:r>
+            <w:r>
+              <w:rPr>
+                <w:b/>
+              </w:rPr>
+              <w:t>elegir</w:t>
+            </w:r>
+            <w:r>
+              <w:t xml:space="preserve"> un tipo de protocolo/reprogramación</w:t>
+            </w:r>
+          </w:p>
+        </w:tc>
+        <w:tc>
+          <w:tcPr>
+            <w:tcW w:type="dxa" w:w="2880"/>
+          </w:tcPr>
+          <w:p>
+            <w:r/>
+            <w:r>
+              <w:t>No quiero que se arme una lista por defecto en cualquier pendiente que creo</w:t>
+            </w:r>
+          </w:p>
+        </w:tc>
+      </w:tr>
     </w:tbl>
     <w:p>
       <w:pPr>

</xml_diff>

<commit_message>
Tablero de Inicio «¿qué hago hoy?» (candidato final · paso 1)
Nueva vista «🏠 Inicio» que pasa a ser la pantalla de apertura: resumen
accionable del día derivado del motor de estado integral —
- tarjetas clickeables: equipos detenidos (No Operativo/ST), OT abiertas
  por avanzar, reportes de reprogramación por generar/firmar/oficializar/
  cerrar, pendientes vencidos, MP del mes sin ejecutar, FS/NU sin resolver;
  cada una lleva a su vista (las de reprogramación, a Pendientes filtrado
  y agrupado por servicio);
- lista de los equipos más críticos con su estado y «siguiente acción»,
  con acceso directo a la ficha.

README y ENTENDIMIENTO (build .40 + registro de ajustes) actualizados.
APP_BUILD 2026-06-16.40, versión autónoma regenerada.
</commit_message>
<xml_diff>
--- a/ENTENDIMIENTO.docx
+++ b/ENTENDIMIENTO.docx
@@ -102,7 +102,7 @@
         <w:rPr>
           <w:i/>
         </w:rPr>
-        <w:t>Última actualización: 2026-06-16 · App build 2026-06-16.39</w:t>
+        <w:t>Última actualización: 2026-06-16 · App build 2026-06-16.40</w:t>
       </w:r>
     </w:p>
     <w:p>
@@ -2545,6 +2545,108 @@
           </w:p>
         </w:tc>
       </w:tr>
+      <w:tr>
+        <w:tc>
+          <w:tcPr>
+            <w:tcW w:type="dxa" w:w="2880"/>
+          </w:tcPr>
+          <w:p>
+            <w:r/>
+            <w:r>
+              <w:t>2026-06-16</w:t>
+            </w:r>
+          </w:p>
+        </w:tc>
+        <w:tc>
+          <w:tcPr>
+            <w:tcW w:type="dxa" w:w="2880"/>
+          </w:tcPr>
+          <w:p>
+            <w:r/>
+            <w:r>
+              <w:rPr>
+                <w:b/>
+              </w:rPr>
+              <w:t>Archivo de grabaciones</w:t>
+            </w:r>
+            <w:r>
+              <w:t xml:space="preserve"> en el repo (</w:t>
+            </w:r>
+            <w:r>
+              <w:rPr>
+                <w:rFonts w:ascii="Consolas" w:hAnsi="Consolas"/>
+                <w:sz w:val="19"/>
+              </w:rPr>
+              <w:t>grabaciones/</w:t>
+            </w:r>
+            <w:r>
+              <w:t xml:space="preserve">) + </w:t>
+            </w:r>
+            <w:r>
+              <w:rPr>
+                <w:rFonts w:ascii="Consolas" w:hAnsi="Consolas"/>
+                <w:sz w:val="19"/>
+              </w:rPr>
+              <w:t>GRABACIONES.md</w:t>
+            </w:r>
+            <w:r>
+              <w:t xml:space="preserve"> con qué reveló cada una</w:t>
+            </w:r>
+          </w:p>
+        </w:tc>
+        <w:tc>
+          <w:tcPr>
+            <w:tcW w:type="dxa" w:w="2880"/>
+          </w:tcPr>
+          <w:p>
+            <w:r/>
+            <w:r>
+              <w:t>Que el repositorio guarde las grabaciones y para qué sirvieron (entendimiento acumulativo)</w:t>
+            </w:r>
+          </w:p>
+        </w:tc>
+      </w:tr>
+      <w:tr>
+        <w:tc>
+          <w:tcPr>
+            <w:tcW w:type="dxa" w:w="2880"/>
+          </w:tcPr>
+          <w:p>
+            <w:r/>
+            <w:r>
+              <w:t>2026-06-16</w:t>
+            </w:r>
+          </w:p>
+        </w:tc>
+        <w:tc>
+          <w:tcPr>
+            <w:tcW w:type="dxa" w:w="2880"/>
+          </w:tcPr>
+          <w:p>
+            <w:r/>
+            <w:r>
+              <w:rPr>
+                <w:b/>
+              </w:rPr>
+              <w:t>Tablero de Inicio «¿qué hago hoy?»</w:t>
+            </w:r>
+            <w:r>
+              <w:t>: la app abre con el resumen accionable del día (equipos detenidos, OT por avanzar, reprogramaciones por etapa, MP del mes, pendientes vencidos) y los equipos más críticos; cada tarjeta lleva a su vista</w:t>
+            </w:r>
+          </w:p>
+        </w:tc>
+        <w:tc>
+          <w:tcPr>
+            <w:tcW w:type="dxa" w:w="2880"/>
+          </w:tcPr>
+          <w:p>
+            <w:r/>
+            <w:r>
+              <w:t>Empezar el día sabiendo de inmediato qué tengo que hacer, sin armarlo a mano</w:t>
+            </w:r>
+          </w:p>
+        </w:tc>
+      </w:tr>
     </w:tbl>
     <w:p>
       <w:pPr>

</xml_diff>

<commit_message>
Bitácora del equipo: filas clickeables a su evento de origen
Según una grabación, el usuario hizo clic en una fila de la bitácora
esperando abrir ese evento. Ahora cada entrada lleva una referencia a su
origen y la fila es clickeable:
- reprogramación → su pendiente (donde se trabaja el reporte) o, si no
  hay pendiente vinculado, la MP;
- mantención preventiva → su registro (editar);
- apertura/informe/OC/avances/cierre del correctivo → el expediente (OT).

APP_BUILD 2026-06-16.41, versión autónoma y ENTENDIMIENTO actualizados.
</commit_message>
<xml_diff>
--- a/ENTENDIMIENTO.docx
+++ b/ENTENDIMIENTO.docx
@@ -102,7 +102,7 @@
         <w:rPr>
           <w:i/>
         </w:rPr>
-        <w:t>Última actualización: 2026-06-16 · App build 2026-06-16.40</w:t>
+        <w:t>Última actualización: 2026-06-16 · App build 2026-06-16.41</w:t>
       </w:r>
     </w:p>
     <w:p>
@@ -2647,6 +2647,47 @@
           </w:p>
         </w:tc>
       </w:tr>
+      <w:tr>
+        <w:tc>
+          <w:tcPr>
+            <w:tcW w:type="dxa" w:w="2880"/>
+          </w:tcPr>
+          <w:p>
+            <w:r/>
+            <w:r>
+              <w:t>2026-06-16</w:t>
+            </w:r>
+          </w:p>
+        </w:tc>
+        <w:tc>
+          <w:tcPr>
+            <w:tcW w:type="dxa" w:w="2880"/>
+          </w:tcPr>
+          <w:p>
+            <w:r/>
+            <w:r>
+              <w:rPr>
+                <w:b/>
+              </w:rPr>
+              <w:t>Bitácora clickeable</w:t>
+            </w:r>
+            <w:r>
+              <w:t>: cada fila de la bitácora del equipo abre su evento de origen (la reprogramación/pendiente, la MP o el expediente)</w:t>
+            </w:r>
+          </w:p>
+        </w:tc>
+        <w:tc>
+          <w:tcPr>
+            <w:tcW w:type="dxa" w:w="2880"/>
+          </w:tcPr>
+          <w:p>
+            <w:r/>
+            <w:r>
+              <w:t>Cuando veo un evento en la bitácora quiero ir directo a trabajarlo</w:t>
+            </w:r>
+          </w:p>
+        </w:tc>
+      </w:tr>
     </w:tbl>
     <w:p>
       <w:pPr>

</xml_diff>

<commit_message>
Repaso de clickeabilidad: filas del Historial y de Correctivo editables
Auditoría de todo lo que se ve clickeable (class="click", cursor:pointer,
data-*): cada elemento tiene su acción. Estaban ya bien: tarjetas y
equipos críticos del Inicio, filas de Equipos/Plan/Gantt/Correctivos →
ficha, Pendientes (desplegar + enlace de equipo + chips), Operatividad,
sección de pendientes de la ficha, bitácora, enlaces del resumen, botones
de orden, y copiar en chips/campos.

Huecos cerrados: en la ficha, la fila del Historial ahora abre la
mantención para editar, y la fila del detalle de Correctivo abre el
evento — antes solo el botón ✎. Los botones ✎/🗑 siguen funcionando sin
conflicto (se evalúan antes que el clic de fila).

APP_BUILD 2026-06-16.42, versión autónoma y ENTENDIMIENTO actualizados.
</commit_message>
<xml_diff>
--- a/ENTENDIMIENTO.docx
+++ b/ENTENDIMIENTO.docx
@@ -102,7 +102,7 @@
         <w:rPr>
           <w:i/>
         </w:rPr>
-        <w:t>Última actualización: 2026-06-16 · App build 2026-06-16.41</w:t>
+        <w:t>Última actualización: 2026-06-16 · App build 2026-06-16.42</w:t>
       </w:r>
     </w:p>
     <w:p>
@@ -2688,6 +2688,47 @@
           </w:p>
         </w:tc>
       </w:tr>
+      <w:tr>
+        <w:tc>
+          <w:tcPr>
+            <w:tcW w:type="dxa" w:w="2880"/>
+          </w:tcPr>
+          <w:p>
+            <w:r/>
+            <w:r>
+              <w:t>2026-06-16</w:t>
+            </w:r>
+          </w:p>
+        </w:tc>
+        <w:tc>
+          <w:tcPr>
+            <w:tcW w:type="dxa" w:w="2880"/>
+          </w:tcPr>
+          <w:p>
+            <w:r/>
+            <w:r>
+              <w:rPr>
+                <w:b/>
+              </w:rPr>
+              <w:t>Repaso de clickeabilidad</w:t>
+            </w:r>
+            <w:r>
+              <w:t>: filas del Historial → editar la mantención; filas del detalle de Correctivo → editar el evento (antes solo el botón ✎)</w:t>
+            </w:r>
+          </w:p>
+        </w:tc>
+        <w:tc>
+          <w:tcPr>
+            <w:tcW w:type="dxa" w:w="2880"/>
+          </w:tcPr>
+          <w:p>
+            <w:r/>
+            <w:r>
+              <w:t>Que todo lo que parece clickeable lo sea, y poder ir directo a editar desde la fila</w:t>
+            </w:r>
+          </w:p>
+        </w:tc>
+      </w:tr>
     </w:tbl>
     <w:p>
       <w:pPr>

</xml_diff>

<commit_message>
Prototipo candidato final: timeline fuera, bitácora filtrable, avance rápido, grabación con clics muertos
Cuatro ajustes pedidos (y derivados de la grabación):
- Se elimina la línea de tiempo de los expedientes en la ficha (no aportaba
  sobre la bitácora).
- Bitácora del equipo filtrable: chips por categoría (Preventivo /
  Reprogramación / Correctivo / Pendiente, con conteos) y búsqueda; el
  filtro se reinicia al abrir cada ficha.
- Registro rápido de avances correctivos: botón «➕ Avance» en cada
  expediente abierto de la vista Correctivos abre el modal de avance sin
  entrar a la ficha (para registrar envíos/recepciones al revisar carpetas).
- Grabación v4: cada clic guarda la entidad tocada y se detectan «clics
  muertos» (clic en elemento pasivo que no produce navegación/modal/toast),
  señal directa de una expectativa no cumplida. Fix: grabEvento devuelve el
  objeto almacenado para poder marcarlo.

APP_BUILD 2026-06-16.43, versión autónoma y ENTENDIMIENTO actualizados.
</commit_message>
<xml_diff>
--- a/ENTENDIMIENTO.docx
+++ b/ENTENDIMIENTO.docx
@@ -102,7 +102,7 @@
         <w:rPr>
           <w:i/>
         </w:rPr>
-        <w:t>Última actualización: 2026-06-16 · App build 2026-06-16.42</w:t>
+        <w:t>Última actualización: 2026-06-16 · App build 2026-06-16.43</w:t>
       </w:r>
     </w:p>
     <w:p>
@@ -2729,6 +2729,179 @@
           </w:p>
         </w:tc>
       </w:tr>
+      <w:tr>
+        <w:tc>
+          <w:tcPr>
+            <w:tcW w:type="dxa" w:w="2880"/>
+          </w:tcPr>
+          <w:p>
+            <w:r/>
+            <w:r>
+              <w:t>2026-06-16</w:t>
+            </w:r>
+          </w:p>
+        </w:tc>
+        <w:tc>
+          <w:tcPr>
+            <w:tcW w:type="dxa" w:w="2880"/>
+          </w:tcPr>
+          <w:p>
+            <w:r/>
+            <w:r>
+              <w:t xml:space="preserve">Se </w:t>
+            </w:r>
+            <w:r>
+              <w:rPr>
+                <w:b/>
+              </w:rPr>
+              <w:t>elimina la línea de tiempo</w:t>
+            </w:r>
+            <w:r>
+              <w:t xml:space="preserve"> de los expedientes en la ficha</w:t>
+            </w:r>
+          </w:p>
+        </w:tc>
+        <w:tc>
+          <w:tcPr>
+            <w:tcW w:type="dxa" w:w="2880"/>
+          </w:tcPr>
+          <w:p>
+            <w:r/>
+            <w:r>
+              <w:t>No me servía de mucho; la bitácora ya cuenta la historia</w:t>
+            </w:r>
+          </w:p>
+        </w:tc>
+      </w:tr>
+      <w:tr>
+        <w:tc>
+          <w:tcPr>
+            <w:tcW w:type="dxa" w:w="2880"/>
+          </w:tcPr>
+          <w:p>
+            <w:r/>
+            <w:r>
+              <w:t>2026-06-16</w:t>
+            </w:r>
+          </w:p>
+        </w:tc>
+        <w:tc>
+          <w:tcPr>
+            <w:tcW w:type="dxa" w:w="2880"/>
+          </w:tcPr>
+          <w:p>
+            <w:r/>
+            <w:r>
+              <w:rPr>
+                <w:b/>
+              </w:rPr>
+              <w:t>Bitácora filtrable</w:t>
+            </w:r>
+            <w:r>
+              <w:t>: chips por categoría (Preventivo/Reprogramación/Correctivo/Pendiente) y búsqueda</w:t>
+            </w:r>
+          </w:p>
+        </w:tc>
+        <w:tc>
+          <w:tcPr>
+            <w:tcW w:type="dxa" w:w="2880"/>
+          </w:tcPr>
+          <w:p>
+            <w:r/>
+            <w:r>
+              <w:t>Encontrar rápido lo que busco dentro de la historia del equipo</w:t>
+            </w:r>
+          </w:p>
+        </w:tc>
+      </w:tr>
+      <w:tr>
+        <w:tc>
+          <w:tcPr>
+            <w:tcW w:type="dxa" w:w="2880"/>
+          </w:tcPr>
+          <w:p>
+            <w:r/>
+            <w:r>
+              <w:t>2026-06-16</w:t>
+            </w:r>
+          </w:p>
+        </w:tc>
+        <w:tc>
+          <w:tcPr>
+            <w:tcW w:type="dxa" w:w="2880"/>
+          </w:tcPr>
+          <w:p>
+            <w:r/>
+            <w:r>
+              <w:rPr>
+                <w:b/>
+              </w:rPr>
+              <w:t>Registro rápido de avances correctivos</w:t>
+            </w:r>
+            <w:r>
+              <w:t xml:space="preserve"> (➕ Avance) desde la vista Correctivos, sin entrar a la ficha</w:t>
+            </w:r>
+          </w:p>
+        </w:tc>
+        <w:tc>
+          <w:tcPr>
+            <w:tcW w:type="dxa" w:w="2880"/>
+          </w:tcPr>
+          <w:p>
+            <w:r/>
+            <w:r>
+              <w:t>Reviso carpetas y necesito registrar envíos/recepciones rápido; la vía actual era lenta</w:t>
+            </w:r>
+          </w:p>
+        </w:tc>
+      </w:tr>
+      <w:tr>
+        <w:tc>
+          <w:tcPr>
+            <w:tcW w:type="dxa" w:w="2880"/>
+          </w:tcPr>
+          <w:p>
+            <w:r/>
+            <w:r>
+              <w:t>2026-06-16</w:t>
+            </w:r>
+          </w:p>
+        </w:tc>
+        <w:tc>
+          <w:tcPr>
+            <w:tcW w:type="dxa" w:w="2880"/>
+          </w:tcPr>
+          <w:p>
+            <w:r/>
+            <w:r>
+              <w:rPr>
+                <w:b/>
+              </w:rPr>
+              <w:t>Grabación más inteligente</w:t>
+            </w:r>
+            <w:r>
+              <w:t xml:space="preserve">: captura la entidad de cada clic y detecta </w:t>
+            </w:r>
+            <w:r>
+              <w:rPr>
+                <w:b/>
+              </w:rPr>
+              <w:t>clics muertos</w:t>
+            </w:r>
+          </w:p>
+        </w:tc>
+        <w:tc>
+          <w:tcPr>
+            <w:tcW w:type="dxa" w:w="2880"/>
+          </w:tcPr>
+          <w:p>
+            <w:r/>
+            <w:r>
+              <w:t>Que la grabación me sirva para que infieras lo que busco con cada clic</w:t>
+            </w:r>
+          </w:p>
+        </w:tc>
+      </w:tr>
     </w:tbl>
     <w:p>
       <w:pPr>

</xml_diff>

<commit_message>
Panel de Verificación de inconsistencias (build 2026-06-16.44)
Nueva vista «🔎 Verificación» que revisa la calidad de los datos y lista
las situaciones que no calzan, cada una con acceso directo a la ficha:

- Equipos detenidos (No Operativo / Servicio Técnico) sin OT abierta
- Expedientes correctivos abiertos sin avance hace más de 21 días
- Reportes de reprogramación firmados sin oficializar
- Reportes de reprogramación vencidos (por generar/imprimir/firmar)
- MP de meses anteriores sin resultado
- FS/NU en planilla sin resolución posterior
- Envíos a Servicio Técnico sin retorno hace más de 30 días
- Pendientes vencidos hace más de 30 días

No descarta ni inventa registros: solo señala. Badge en la barra con el
total. «← Volver» regresa a la vista de verificación (conserva origen).
ENTENDIMIENTO.md/.docx actualizados.
</commit_message>
<xml_diff>
--- a/ENTENDIMIENTO.docx
+++ b/ENTENDIMIENTO.docx
@@ -12,20 +12,27 @@
     </w:p>
     <w:p>
       <w:pPr>
-        <w:ind w:left="280"/>
+        <w:ind w:left="360"/>
       </w:pPr>
+      <w:r>
+        <w:rPr>
+          <w:i/>
+          <w:color w:val="555555"/>
+        </w:rPr>
+        <w:t xml:space="preserve">▏ </w:t>
+      </w:r>
       <w:r>
         <w:rPr>
           <w:b/>
           <w:i/>
-          <w:color w:val="55606B"/>
+          <w:color w:val="555555"/>
         </w:rPr>
         <w:t>Documento vivo.</w:t>
       </w:r>
       <w:r>
         <w:rPr>
           <w:i/>
-          <w:color w:val="55606B"/>
+          <w:color w:val="555555"/>
         </w:rPr>
         <w:t xml:space="preserve"> Aquí se acumula el entendimiento de </w:t>
       </w:r>
@@ -33,76 +40,161 @@
         <w:rPr>
           <w:b/>
           <w:i/>
-          <w:color w:val="55606B"/>
+          <w:color w:val="555555"/>
         </w:rPr>
         <w:t>mi trabajo</w:t>
       </w:r>
       <w:r>
         <w:rPr>
           <w:i/>
-          <w:color w:val="55606B"/>
+          <w:color w:val="555555"/>
         </w:rPr>
-        <w:t xml:space="preserve"> (el del encargado de Equipamiento Clínico del HHHA), el </w:t>
+        <w:t xml:space="preserve"> (el del encargado de</w:t>
+      </w:r>
+    </w:p>
+    <w:p>
+      <w:pPr>
+        <w:ind w:left="360"/>
+      </w:pPr>
+      <w:r>
+        <w:rPr>
+          <w:i/>
+          <w:color w:val="555555"/>
+        </w:rPr>
+        <w:t xml:space="preserve">▏ </w:t>
+      </w:r>
+      <w:r>
+        <w:rPr>
+          <w:i/>
+          <w:color w:val="555555"/>
+        </w:rPr>
+        <w:t xml:space="preserve">Equipamiento Clínico del HHHA), el </w:t>
       </w:r>
       <w:r>
         <w:rPr>
           <w:b/>
           <w:i/>
-          <w:color w:val="55606B"/>
+          <w:color w:val="555555"/>
         </w:rPr>
         <w:t>porqué</w:t>
       </w:r>
       <w:r>
         <w:rPr>
           <w:i/>
-          <w:color w:val="55606B"/>
+          <w:color w:val="555555"/>
         </w:rPr>
-        <w:t xml:space="preserve"> de cada cosa que pido y cómo la aplicación me apoya. Se actualiza con </w:t>
+        <w:t xml:space="preserve"> de cada cosa que pido y cómo la aplicación me</w:t>
+      </w:r>
+    </w:p>
+    <w:p>
+      <w:pPr>
+        <w:ind w:left="360"/>
+      </w:pPr>
+      <w:r>
+        <w:rPr>
+          <w:i/>
+          <w:color w:val="555555"/>
+        </w:rPr>
+        <w:t xml:space="preserve">▏ </w:t>
+      </w:r>
+      <w:r>
+        <w:rPr>
+          <w:i/>
+          <w:color w:val="555555"/>
+        </w:rPr>
+        <w:t xml:space="preserve">apoya. Se actualiza con </w:t>
       </w:r>
       <w:r>
         <w:rPr>
           <w:b/>
           <w:i/>
-          <w:color w:val="55606B"/>
+          <w:color w:val="555555"/>
         </w:rPr>
         <w:t>cada ajuste</w:t>
       </w:r>
       <w:r>
         <w:rPr>
           <w:i/>
-          <w:color w:val="55606B"/>
+          <w:color w:val="555555"/>
         </w:rPr>
-        <w:t xml:space="preserve">. Cuando ya no haya más ajustes, esto es lo que define la </w:t>
+        <w:t>. Cuando ya no haya más ajustes, esto es lo que define</w:t>
+      </w:r>
+    </w:p>
+    <w:p>
+      <w:pPr>
+        <w:ind w:left="360"/>
+      </w:pPr>
+      <w:r>
+        <w:rPr>
+          <w:i/>
+          <w:color w:val="555555"/>
+        </w:rPr>
+        <w:t xml:space="preserve">▏ </w:t>
+      </w:r>
+      <w:r>
+        <w:rPr>
+          <w:i/>
+          <w:color w:val="555555"/>
+        </w:rPr>
+        <w:t xml:space="preserve">la </w:t>
       </w:r>
       <w:r>
         <w:rPr>
           <w:b/>
           <w:i/>
-          <w:color w:val="55606B"/>
+          <w:color w:val="555555"/>
         </w:rPr>
         <w:t>aplicación oficial final</w:t>
       </w:r>
       <w:r>
         <w:rPr>
           <w:i/>
-          <w:color w:val="55606B"/>
+          <w:color w:val="555555"/>
         </w:rPr>
-        <w:t xml:space="preserve"> que se adapta a mi día a día. </w:t>
-      </w:r>
+        <w:t xml:space="preserve"> que se adapta a mi día a día.</w:t>
+      </w:r>
+    </w:p>
+    <w:p>
+      <w:pPr>
+        <w:ind w:left="360"/>
+      </w:pPr>
       <w:r>
         <w:rPr>
           <w:i/>
-          <w:color w:val="55606B"/>
+          <w:color w:val="555555"/>
         </w:rPr>
-        <w:t>Está escrito en primera persona, tal como lo expliqué, para poder leerlo y confirmar que se entendió todo. Si algo no calza con la realidad, se corrige aquí primero.</w:t>
+        <w:t xml:space="preserve">▏ </w:t>
+      </w:r>
+      <w:r>
+        <w:rPr>
+          <w:i/>
+          <w:color w:val="555555"/>
+        </w:rPr>
+        <w:t>*Está escrito en primera persona, tal como lo expliqué, para poder leerlo y confirmar que se</w:t>
       </w:r>
     </w:p>
     <w:p>
+      <w:pPr>
+        <w:ind w:left="360"/>
+      </w:pPr>
       <w:r>
         <w:rPr>
           <w:i/>
+          <w:color w:val="555555"/>
         </w:rPr>
-        <w:t>Última actualización: 2026-06-16 · App build 2026-06-16.43</w:t>
+        <w:t xml:space="preserve">▏ </w:t>
+      </w:r>
+      <w:r>
+        <w:rPr>
+          <w:i/>
+          <w:color w:val="555555"/>
+        </w:rPr>
+        <w:t>entendió todo. Si algo no calza con la realidad, se corrige aquí primero.*</w:t>
+      </w:r>
+    </w:p>
+    <w:p>
+      <w:r>
+        <w:t>_Última actualización: 2026-06-16 · App build 2026-06-16.44_</w:t>
       </w:r>
     </w:p>
     <w:p>
@@ -450,6 +542,7 @@
         </w:tc>
       </w:tr>
     </w:tbl>
+    <w:p/>
     <w:p>
       <w:pPr>
         <w:pStyle w:val="ListBullet"/>
@@ -466,7 +559,7 @@
     </w:p>
     <w:p>
       <w:r>
-        <w:t xml:space="preserve">  el detalle, hago seguimiento y veo qué falta.</w:t>
+        <w:t>el detalle, hago seguimiento y veo qué falta.</w:t>
       </w:r>
     </w:p>
     <w:p>
@@ -494,7 +587,7 @@
     </w:p>
     <w:p>
       <w:r>
-        <w:t xml:space="preserve">  como </w:t>
+        <w:t xml:space="preserve">como </w:t>
       </w:r>
       <w:r>
         <w:rPr>
@@ -526,17 +619,24 @@
     </w:p>
     <w:p>
       <w:r>
-        <w:t xml:space="preserve">  resultado. Si no aparece, sigue como borrador.</w:t>
+        <w:t>resultado. Si no aparece, sigue como borrador.</w:t>
       </w:r>
     </w:p>
     <w:p>
       <w:pPr>
-        <w:ind w:left="280"/>
+        <w:ind w:left="360"/>
       </w:pPr>
       <w:r>
         <w:rPr>
           <w:i/>
-          <w:color w:val="55606B"/>
+          <w:color w:val="555555"/>
+        </w:rPr>
+        <w:t xml:space="preserve">▏ </w:t>
+      </w:r>
+      <w:r>
+        <w:rPr>
+          <w:i/>
+          <w:color w:val="555555"/>
         </w:rPr>
         <w:t xml:space="preserve">En una frase: </w:t>
       </w:r>
@@ -544,7 +644,7 @@
         <w:rPr>
           <w:b/>
           <w:i/>
-          <w:color w:val="55606B"/>
+          <w:color w:val="555555"/>
         </w:rPr>
         <w:t>la app es donde trabajo y acumulo el detalle; la carta es donde queda lo oficial.</w:t>
       </w:r>
@@ -606,7 +706,7 @@
     </w:p>
     <w:p>
       <w:r>
-        <w:t xml:space="preserve">   falta a ese documento/gestión.</w:t>
+        <w:t>falta a ese documento/gestión.</w:t>
       </w:r>
     </w:p>
     <w:p>
@@ -761,9 +861,6 @@
     </w:p>
     <w:p>
       <w:r>
-        <w:t xml:space="preserve">  </w:t>
-      </w:r>
-      <w:r>
         <w:rPr>
           <w:rFonts w:ascii="Consolas" w:hAnsi="Consolas"/>
           <w:sz w:val="19"/>
@@ -794,7 +891,7 @@
     </w:p>
     <w:p>
       <w:r>
-        <w:t xml:space="preserve">  observaciones, </w:t>
+        <w:t xml:space="preserve">observaciones, </w:t>
       </w:r>
       <w:r>
         <w:rPr>
@@ -897,7 +994,7 @@
     </w:p>
     <w:p>
       <w:r>
-        <w:t xml:space="preserve">    en </w:t>
+        <w:t xml:space="preserve">en </w:t>
       </w:r>
       <w:r>
         <w:rPr>
@@ -980,16 +1077,22 @@
     </w:p>
     <w:p>
       <w:r>
-        <w:t xml:space="preserve">disponibilidad de horas del servicio técnico externo*). Esto </w:t>
+        <w:t>disponibilidad de horas del servicio técnico externo</w:t>
       </w:r>
       <w:r>
         <w:rPr>
-          <w:b/>
+          <w:i/>
+        </w:rPr>
+        <w:t xml:space="preserve">). Esto </w:t>
+      </w:r>
+      <w:r>
+        <w:rPr>
+          <w:i/>
         </w:rPr>
         <w:t>no es solo escribir un código</w:t>
       </w:r>
       <w:r>
-        <w:t>:</w:t>
+        <w:t>*:</w:t>
       </w:r>
     </w:p>
     <w:p>
@@ -1039,9 +1142,6 @@
     </w:p>
     <w:p>
       <w:r>
-        <w:t xml:space="preserve">   </w:t>
-      </w:r>
-      <w:r>
         <w:rPr>
           <w:b/>
         </w:rPr>
@@ -1096,7 +1196,7 @@
     </w:p>
     <w:p>
       <w:r>
-        <w:t xml:space="preserve">   equipos médicos*</w:t>
+        <w:t>equipos médicos*</w:t>
       </w:r>
       <w:r>
         <w:rPr>
@@ -1110,7 +1210,7 @@
     </w:p>
     <w:p>
       <w:r>
-        <w:t xml:space="preserve">   de cada servicio para conseguir la firma de su supervisor de una sola vez.)*</w:t>
+        <w:t>de cada servicio para conseguir la firma de su supervisor de una sola vez.)*</w:t>
       </w:r>
     </w:p>
     <w:p>
@@ -1138,9 +1238,6 @@
     </w:p>
     <w:p>
       <w:r>
-        <w:t xml:space="preserve">   </w:t>
-      </w:r>
-      <w:r>
         <w:rPr>
           <w:b/>
         </w:rPr>
@@ -1152,7 +1249,7 @@
     </w:p>
     <w:p>
       <w:r>
-        <w:t xml:space="preserve">   a </w:t>
+        <w:t xml:space="preserve">a </w:t>
       </w:r>
       <w:r>
         <w:rPr>
@@ -1274,7 +1371,7 @@
     </w:p>
     <w:p>
       <w:r>
-        <w:t xml:space="preserve">  reportes de servicio y los envíos a servicio técnico).</w:t>
+        <w:t>reportes de servicio y los envíos a servicio técnico).</w:t>
       </w:r>
     </w:p>
     <w:p>
@@ -1287,7 +1384,7 @@
     </w:p>
     <w:p>
       <w:r>
-        <w:t xml:space="preserve">  Ejecución → Cierre</w:t>
+        <w:t>Ejecución → Cierre</w:t>
       </w:r>
       <w:r>
         <w:rPr>
@@ -1345,7 +1442,7 @@
     </w:p>
     <w:p>
       <w:r>
-        <w:t xml:space="preserve">  cuento los </w:t>
+        <w:t xml:space="preserve">cuento los </w:t>
       </w:r>
       <w:r>
         <w:rPr>
@@ -1385,7 +1482,7 @@
     </w:p>
     <w:p>
       <w:r>
-        <w:t xml:space="preserve">  envío). Debo poder </w:t>
+        <w:t xml:space="preserve">envío). Debo poder </w:t>
       </w:r>
       <w:r>
         <w:rPr>
@@ -1601,6 +1698,51 @@
       </w:r>
     </w:p>
     <w:p>
+      <w:r>
+        <w:t xml:space="preserve">Como apoyo a la operatividad existe también el </w:t>
+      </w:r>
+      <w:r>
+        <w:rPr>
+          <w:b/>
+        </w:rPr>
+        <w:t>panel de Verificación</w:t>
+      </w:r>
+      <w:r>
+        <w:t>: la app revisa sola la</w:t>
+      </w:r>
+    </w:p>
+    <w:p>
+      <w:r>
+        <w:rPr>
+          <w:b/>
+        </w:rPr>
+        <w:t>consistencia de los datos</w:t>
+      </w:r>
+      <w:r>
+        <w:t xml:space="preserve"> y me lista las situaciones que merecen una mirada (equipos detenidos</w:t>
+      </w:r>
+    </w:p>
+    <w:p>
+      <w:r>
+        <w:t>sin OT que los respalde, expedientes sin avance hace semanas, reportes de reprogramación vencidos o</w:t>
+      </w:r>
+    </w:p>
+    <w:p>
+      <w:r>
+        <w:t>firmados sin oficializar, MP de meses pasados sin resultado, FS/NU sin resolución, envíos sin</w:t>
+      </w:r>
+    </w:p>
+    <w:p>
+      <w:r>
+        <w:t>retorno, pendientes muy atrasados). Cada hallazgo lleva directo a la ficha del equipo. **No inventa</w:t>
+      </w:r>
+    </w:p>
+    <w:p>
+      <w:r>
+        <w:t>ni descarta nada**: solo señala lo que no calza para que yo decida.</w:t>
+      </w:r>
+    </w:p>
+    <w:p>
       <w:pPr>
         <w:pStyle w:val="Heading2"/>
       </w:pPr>
@@ -1624,7 +1766,7 @@
     </w:p>
     <w:p>
       <w:r>
-        <w:t xml:space="preserve">   la app manda en el detalle y el seguimiento.</w:t>
+        <w:t>la app manda en el detalle y el seguimiento.</w:t>
       </w:r>
     </w:p>
     <w:p>
@@ -1643,7 +1785,7 @@
     </w:p>
     <w:p>
       <w:r>
-        <w:t xml:space="preserve">   resultado.</w:t>
+        <w:t>resultado.</w:t>
       </w:r>
     </w:p>
     <w:p>
@@ -1662,7 +1804,7 @@
     </w:p>
     <w:p>
       <w:r>
-        <w:t xml:space="preserve">   siguiente acción.</w:t>
+        <w:t>siguiente acción.</w:t>
       </w:r>
     </w:p>
     <w:p>
@@ -1681,7 +1823,7 @@
     </w:p>
     <w:p>
       <w:r>
-        <w:t xml:space="preserve">   y la app debe acompañar ese ciclo, no entorpecerlo.</w:t>
+        <w:t>y la app debe acompañar ese ciclo, no entorpecerlo.</w:t>
       </w:r>
     </w:p>
     <w:p>
@@ -1700,7 +1842,7 @@
     </w:p>
     <w:p>
       <w:r>
-        <w:t xml:space="preserve">   ver/exportar solo lo que necesito.</w:t>
+        <w:t>ver/exportar solo lo que necesito.</w:t>
       </w:r>
     </w:p>
     <w:p>
@@ -1713,12 +1855,19 @@
     </w:p>
     <w:p>
       <w:pPr>
-        <w:ind w:left="280"/>
+        <w:ind w:left="360"/>
       </w:pPr>
       <w:r>
         <w:rPr>
           <w:i/>
-          <w:color w:val="55606B"/>
+          <w:color w:val="555555"/>
+        </w:rPr>
+        <w:t xml:space="preserve">▏ </w:t>
+      </w:r>
+      <w:r>
+        <w:rPr>
+          <w:i/>
+          <w:color w:val="555555"/>
         </w:rPr>
         <w:t xml:space="preserve">Cada entrada deja constancia del </w:t>
       </w:r>
@@ -1726,14 +1875,14 @@
         <w:rPr>
           <w:b/>
           <w:i/>
-          <w:color w:val="55606B"/>
+          <w:color w:val="555555"/>
         </w:rPr>
         <w:t>ajuste</w:t>
       </w:r>
       <w:r>
         <w:rPr>
           <w:i/>
-          <w:color w:val="55606B"/>
+          <w:color w:val="555555"/>
         </w:rPr>
         <w:t xml:space="preserve"> y, sobre todo, del </w:t>
       </w:r>
@@ -1741,14 +1890,14 @@
         <w:rPr>
           <w:b/>
           <w:i/>
-          <w:color w:val="55606B"/>
+          <w:color w:val="555555"/>
         </w:rPr>
         <w:t>porqué</w:t>
       </w:r>
       <w:r>
         <w:rPr>
           <w:i/>
-          <w:color w:val="55606B"/>
+          <w:color w:val="555555"/>
         </w:rPr>
         <w:t xml:space="preserve"> (mi necesidad real).</w:t>
       </w:r>
@@ -1828,7 +1977,7 @@
           <w:p>
             <w:r/>
             <w:r>
-              <w:t>2026-06-15</w:t>
+              <w:t>2026‑06‑15</w:t>
             </w:r>
           </w:p>
         </w:tc>
@@ -1872,7 +2021,7 @@
           <w:p>
             <w:r/>
             <w:r>
-              <w:t>2026-06-15</w:t>
+              <w:t>2026‑06‑15</w:t>
             </w:r>
           </w:p>
         </w:tc>
@@ -1907,7 +2056,7 @@
           <w:p>
             <w:r/>
             <w:r>
-              <w:t>2026-06-16</w:t>
+              <w:t>2026‑06‑16</w:t>
             </w:r>
           </w:p>
         </w:tc>
@@ -1957,7 +2106,7 @@
           <w:p>
             <w:r/>
             <w:r>
-              <w:t>2026-06-16</w:t>
+              <w:t>2026‑06‑16</w:t>
             </w:r>
           </w:p>
         </w:tc>
@@ -2001,7 +2150,7 @@
           <w:p>
             <w:r/>
             <w:r>
-              <w:t>2026-06-16</w:t>
+              <w:t>2026‑06‑16</w:t>
             </w:r>
           </w:p>
         </w:tc>
@@ -2051,7 +2200,7 @@
           <w:p>
             <w:r/>
             <w:r>
-              <w:t>2026-06-16</w:t>
+              <w:t>2026‑06‑16</w:t>
             </w:r>
           </w:p>
         </w:tc>
@@ -2098,7 +2247,7 @@
           <w:p>
             <w:r/>
             <w:r>
-              <w:t>2026-06-16</w:t>
+              <w:t>2026‑06‑16</w:t>
             </w:r>
           </w:p>
         </w:tc>
@@ -2139,7 +2288,7 @@
           <w:p>
             <w:r/>
             <w:r>
-              <w:t>2026-06-16</w:t>
+              <w:t>2026‑06‑16</w:t>
             </w:r>
           </w:p>
         </w:tc>
@@ -2183,7 +2332,7 @@
           <w:p>
             <w:r/>
             <w:r>
-              <w:t>2026-06-16</w:t>
+              <w:t>2026‑06‑16</w:t>
             </w:r>
           </w:p>
         </w:tc>
@@ -2224,7 +2373,7 @@
           <w:p>
             <w:r/>
             <w:r>
-              <w:t>2026-06-16</w:t>
+              <w:t>2026‑06‑16</w:t>
             </w:r>
           </w:p>
         </w:tc>
@@ -2274,7 +2423,7 @@
           <w:p>
             <w:r/>
             <w:r>
-              <w:t>2026-06-16</w:t>
+              <w:t>2026‑06‑16</w:t>
             </w:r>
           </w:p>
         </w:tc>
@@ -2315,7 +2464,7 @@
           <w:p>
             <w:r/>
             <w:r>
-              <w:t>2026-06-16</w:t>
+              <w:t>2026‑06‑16</w:t>
             </w:r>
           </w:p>
         </w:tc>
@@ -2356,7 +2505,7 @@
           <w:p>
             <w:r/>
             <w:r>
-              <w:t>2026-06-16</w:t>
+              <w:t>2026‑06‑16</w:t>
             </w:r>
           </w:p>
         </w:tc>
@@ -2406,7 +2555,7 @@
           <w:p>
             <w:r/>
             <w:r>
-              <w:t>2026-06-16</w:t>
+              <w:t>2026‑06‑16</w:t>
             </w:r>
           </w:p>
         </w:tc>
@@ -2441,7 +2590,7 @@
           <w:p>
             <w:r/>
             <w:r>
-              <w:t>2026-06-16</w:t>
+              <w:t>2026‑06‑16</w:t>
             </w:r>
           </w:p>
         </w:tc>
@@ -2491,7 +2640,7 @@
           <w:p>
             <w:r/>
             <w:r>
-              <w:t>2026-06-16</w:t>
+              <w:t>2026‑06‑16</w:t>
             </w:r>
           </w:p>
         </w:tc>
@@ -2553,7 +2702,7 @@
           <w:p>
             <w:r/>
             <w:r>
-              <w:t>2026-06-16</w:t>
+              <w:t>2026‑06‑16</w:t>
             </w:r>
           </w:p>
         </w:tc>
@@ -2614,7 +2763,7 @@
           <w:p>
             <w:r/>
             <w:r>
-              <w:t>2026-06-16</w:t>
+              <w:t>2026‑06‑16</w:t>
             </w:r>
           </w:p>
         </w:tc>
@@ -2655,7 +2804,7 @@
           <w:p>
             <w:r/>
             <w:r>
-              <w:t>2026-06-16</w:t>
+              <w:t>2026‑06‑16</w:t>
             </w:r>
           </w:p>
         </w:tc>
@@ -2696,7 +2845,7 @@
           <w:p>
             <w:r/>
             <w:r>
-              <w:t>2026-06-16</w:t>
+              <w:t>2026‑06‑16</w:t>
             </w:r>
           </w:p>
         </w:tc>
@@ -2737,7 +2886,7 @@
           <w:p>
             <w:r/>
             <w:r>
-              <w:t>2026-06-16</w:t>
+              <w:t>2026‑06‑16</w:t>
             </w:r>
           </w:p>
         </w:tc>
@@ -2781,7 +2930,7 @@
           <w:p>
             <w:r/>
             <w:r>
-              <w:t>2026-06-16</w:t>
+              <w:t>2026‑06‑16</w:t>
             </w:r>
           </w:p>
         </w:tc>
@@ -2822,7 +2971,7 @@
           <w:p>
             <w:r/>
             <w:r>
-              <w:t>2026-06-16</w:t>
+              <w:t>2026‑06‑16</w:t>
             </w:r>
           </w:p>
         </w:tc>
@@ -2863,7 +3012,7 @@
           <w:p>
             <w:r/>
             <w:r>
-              <w:t>2026-06-16</w:t>
+              <w:t>2026‑06‑16</w:t>
             </w:r>
           </w:p>
         </w:tc>
@@ -2902,7 +3051,49 @@
           </w:p>
         </w:tc>
       </w:tr>
+      <w:tr>
+        <w:tc>
+          <w:tcPr>
+            <w:tcW w:type="dxa" w:w="2880"/>
+          </w:tcPr>
+          <w:p>
+            <w:r/>
+            <w:r>
+              <w:t>2026‑06‑16</w:t>
+            </w:r>
+          </w:p>
+        </w:tc>
+        <w:tc>
+          <w:tcPr>
+            <w:tcW w:type="dxa" w:w="2880"/>
+          </w:tcPr>
+          <w:p>
+            <w:r/>
+            <w:r>
+              <w:rPr>
+                <w:b/>
+              </w:rPr>
+              <w:t>Panel de Verificación de inconsistencias</w:t>
+            </w:r>
+            <w:r>
+              <w:t>: la app revisa la calidad de los datos (detenidos sin OT, expedientes estancados, reportes vencidos/firmados sin oficializar, MP vencidas, FS/NU sin resolver, envíos sin retorno, pendientes muy atrasados); cada hallazgo abre la ficha</w:t>
+            </w:r>
+          </w:p>
+        </w:tc>
+        <w:tc>
+          <w:tcPr>
+            <w:tcW w:type="dxa" w:w="2880"/>
+          </w:tcPr>
+          <w:p>
+            <w:r/>
+            <w:r>
+              <w:t>Detectar de una lo que no calza, sin descartar ni inventar nada, para corregirlo antes de oficializar</w:t>
+            </w:r>
+          </w:p>
+        </w:tc>
+      </w:tr>
     </w:tbl>
+    <w:p/>
     <w:p>
       <w:pPr>
         <w:pStyle w:val="Heading2"/>
@@ -2913,12 +3104,19 @@
     </w:p>
     <w:p>
       <w:pPr>
-        <w:ind w:left="280"/>
+        <w:ind w:left="360"/>
       </w:pPr>
       <w:r>
         <w:rPr>
           <w:i/>
-          <w:color w:val="55606B"/>
+          <w:color w:val="555555"/>
+        </w:rPr>
+        <w:t xml:space="preserve">▏ </w:t>
+      </w:r>
+      <w:r>
+        <w:rPr>
+          <w:i/>
+          <w:color w:val="555555"/>
         </w:rPr>
         <w:t>Espacio para dudas abiertas y lo que falta entender antes de la versión final.</w:t>
       </w:r>
@@ -2961,7 +3159,7 @@
     </w:p>
     <w:p>
       <w:r>
-        <w:t xml:space="preserve">  por qué) y luego se construye en la app.</w:t>
+        <w:t>por qué) y luego se construye en la app.</w:t>
       </w:r>
     </w:p>
     <w:p>
@@ -2982,9 +3180,6 @@
       </w:r>
     </w:p>
     <w:p>
-      <w:r>
-        <w:t xml:space="preserve">  </w:t>
-      </w:r>
       <w:r>
         <w:rPr>
           <w:b/>

</xml_diff>

<commit_message>
Imprimir ficha del equipo para la carpeta física (build 2026-06-16.45)
Nuevo botón «🖨 Imprimir ficha» en la ficha del equipo que genera una
hoja limpia y autocontenida para archivar en la carpeta física:

- Encabezado institucional (Hospital HHHA · Equipamiento Clínico · MP 2026)
- Identificación completa del equipo (todos los campos)
- Estado actual + días en estado + siguiente acción
- Bitácora completa en orden cronológico
- Pie con fecha de generación, build y línea de firma

Usa una capa de impresión aislada (body.print-ficha + #ficha-print) que
no interfiere con la pantalla y se limpia sola al terminar (afterprint).
ENTENDIMIENTO.md/.docx actualizados.
</commit_message>
<xml_diff>
--- a/ENTENDIMIENTO.docx
+++ b/ENTENDIMIENTO.docx
@@ -194,7 +194,7 @@
     </w:p>
     <w:p>
       <w:r>
-        <w:t>_Última actualización: 2026-06-16 · App build 2026-06-16.44_</w:t>
+        <w:t>_Última actualización: 2026-06-16 · App build 2026-06-16.45_</w:t>
       </w:r>
     </w:p>
     <w:p>
@@ -1740,6 +1740,53 @@
     <w:p>
       <w:r>
         <w:t>ni descarta nada**: solo señala lo que no calza para que yo decida.</w:t>
+      </w:r>
+    </w:p>
+    <w:p>
+      <w:r>
+        <w:t xml:space="preserve">Desde la ficha puedo </w:t>
+      </w:r>
+      <w:r>
+        <w:rPr>
+          <w:b/>
+        </w:rPr>
+        <w:t>imprimir una hoja limpia del equipo</w:t>
+      </w:r>
+      <w:r>
+        <w:t xml:space="preserve"> («🖨 Imprimir ficha») para archivar en</w:t>
+      </w:r>
+    </w:p>
+    <w:p>
+      <w:r>
+        <w:t xml:space="preserve">su </w:t>
+      </w:r>
+      <w:r>
+        <w:rPr>
+          <w:b/>
+        </w:rPr>
+        <w:t>carpeta física</w:t>
+      </w:r>
+      <w:r>
+        <w:t>: lleva la identificación completa, el estado actual con la siguiente acción y</w:t>
+      </w:r>
+    </w:p>
+    <w:p>
+      <w:r>
+        <w:t xml:space="preserve">la </w:t>
+      </w:r>
+      <w:r>
+        <w:rPr>
+          <w:b/>
+        </w:rPr>
+        <w:t>bitácora completa</w:t>
+      </w:r>
+      <w:r>
+        <w:t xml:space="preserve"> en orden cronológico, más la fecha de generación y una línea de firma. Es</w:t>
+      </w:r>
+    </w:p>
+    <w:p>
+      <w:r>
+        <w:t>el puente entre la app y el papel que vive en la carpeta de cada equipo.</w:t>
       </w:r>
     </w:p>
     <w:p>
@@ -3092,6 +3139,47 @@
           </w:p>
         </w:tc>
       </w:tr>
+      <w:tr>
+        <w:tc>
+          <w:tcPr>
+            <w:tcW w:type="dxa" w:w="2880"/>
+          </w:tcPr>
+          <w:p>
+            <w:r/>
+            <w:r>
+              <w:t>2026‑06‑16</w:t>
+            </w:r>
+          </w:p>
+        </w:tc>
+        <w:tc>
+          <w:tcPr>
+            <w:tcW w:type="dxa" w:w="2880"/>
+          </w:tcPr>
+          <w:p>
+            <w:r/>
+            <w:r>
+              <w:rPr>
+                <w:b/>
+              </w:rPr>
+              <w:t>Imprimir ficha del equipo</w:t>
+            </w:r>
+            <w:r>
+              <w:t xml:space="preserve"> («🖨 Imprimir ficha»): hoja limpia con identificación, estado, siguiente acción y bitácora completa + línea de firma, lista para la carpeta física</w:t>
+            </w:r>
+          </w:p>
+        </w:tc>
+        <w:tc>
+          <w:tcPr>
+            <w:tcW w:type="dxa" w:w="2880"/>
+          </w:tcPr>
+          <w:p>
+            <w:r/>
+            <w:r>
+              <w:t>Necesito una versión en papel ordenada para archivar en la carpeta física de cada equipo</w:t>
+            </w:r>
+          </w:p>
+        </w:tc>
+      </w:tr>
     </w:tbl>
     <w:p/>
     <w:p>

</xml_diff>

<commit_message>
Robustez: resguardo de datos y tolerancia a respaldos parciales (build 2026-06-16.46)
Almacenamiento lleno (localStorage):
- guardar() prioriza el trabajo del usuario (mantenciones/pendientes/
  correctivos), que es irrecuperable; si no hay espacio, libera la
  planilla (recuperable desde el Excel) y reintenta.
- Si aun así no cabe, muestra un aviso fijo e imposible de ignorar con
  botón para descargar un respaldo de inmediato; se oculta solo al
  recuperar el guardado.

Tolerancia a datos parciales:
- normalizarEstado() completa estructuras faltantes (tareas, gestiones,
  subtareas, comentarios, avances) al cargar local y al restaurar un
  respaldo, evitando que un respaldo antiguo o editado a mano rompa la
  ficha (tablaPendientes ya no asume p.tareas/p.gestiones).

Reprogramación a fin de año verificada: el plazo de +30 días cruza
correctamente a 2027 sin desbordar el índice de mes.
ENTENDIMIENTO.md/.docx actualizados.
</commit_message>
<xml_diff>
--- a/ENTENDIMIENTO.docx
+++ b/ENTENDIMIENTO.docx
@@ -194,7 +194,7 @@
     </w:p>
     <w:p>
       <w:r>
-        <w:t>_Última actualización: 2026-06-16 · App build 2026-06-16.45_</w:t>
+        <w:t>_Última actualización: 2026-06-16 · App build 2026-06-16.46_</w:t>
       </w:r>
     </w:p>
     <w:p>
@@ -1890,6 +1890,30 @@
     <w:p>
       <w:r>
         <w:t>ver/exportar solo lo que necesito.</w:t>
+      </w:r>
+    </w:p>
+    <w:p>
+      <w:pPr>
+        <w:pStyle w:val="ListNumber"/>
+      </w:pPr>
+      <w:r>
+        <w:rPr>
+          <w:b/>
+        </w:rPr>
+        <w:t>Mi trabajo no se pierde en silencio.</w:t>
+      </w:r>
+      <w:r>
+        <w:t xml:space="preserve"> La app cuida primero los datos irrecuperables (lo que</w:t>
+      </w:r>
+    </w:p>
+    <w:p>
+      <w:r>
+        <w:t>registro), avisa de forma visible si no puede guardar y tolera respaldos antiguos o parciales sin</w:t>
+      </w:r>
+    </w:p>
+    <w:p>
+      <w:r>
+        <w:t>caerse. Ante la duda, siempre puedo descargar un respaldo.</w:t>
       </w:r>
     </w:p>
     <w:p>
@@ -3180,6 +3204,88 @@
           </w:p>
         </w:tc>
       </w:tr>
+      <w:tr>
+        <w:tc>
+          <w:tcPr>
+            <w:tcW w:type="dxa" w:w="2880"/>
+          </w:tcPr>
+          <w:p>
+            <w:r/>
+            <w:r>
+              <w:t>2026‑06‑16</w:t>
+            </w:r>
+          </w:p>
+        </w:tc>
+        <w:tc>
+          <w:tcPr>
+            <w:tcW w:type="dxa" w:w="2880"/>
+          </w:tcPr>
+          <w:p>
+            <w:r/>
+            <w:r>
+              <w:rPr>
+                <w:b/>
+              </w:rPr>
+              <w:t>Resguardo ante almacenamiento lleno</w:t>
+            </w:r>
+            <w:r>
+              <w:t>: si el navegador no puede guardar, la app prioriza mi trabajo (mantenciones/pendientes/correctivos) liberando la planilla (que se recupera del Excel) y, si aun así no cabe, muestra un aviso fijo para descargar respaldo de inmediato</w:t>
+            </w:r>
+          </w:p>
+        </w:tc>
+        <w:tc>
+          <w:tcPr>
+            <w:tcW w:type="dxa" w:w="2880"/>
+          </w:tcPr>
+          <w:p>
+            <w:r/>
+            <w:r>
+              <w:t>Que nunca pierda mi trabajo en silencio aunque el navegador se quede sin espacio</w:t>
+            </w:r>
+          </w:p>
+        </w:tc>
+      </w:tr>
+      <w:tr>
+        <w:tc>
+          <w:tcPr>
+            <w:tcW w:type="dxa" w:w="2880"/>
+          </w:tcPr>
+          <w:p>
+            <w:r/>
+            <w:r>
+              <w:t>2026‑06‑16</w:t>
+            </w:r>
+          </w:p>
+        </w:tc>
+        <w:tc>
+          <w:tcPr>
+            <w:tcW w:type="dxa" w:w="2880"/>
+          </w:tcPr>
+          <w:p>
+            <w:r/>
+            <w:r>
+              <w:rPr>
+                <w:b/>
+              </w:rPr>
+              <w:t>Tolerancia a respaldos antiguos/editados</w:t>
+            </w:r>
+            <w:r>
+              <w:t>: al cargar, la app completa estructuras faltantes (tareas, gestiones, avances) para no caerse con datos parciales</w:t>
+            </w:r>
+          </w:p>
+        </w:tc>
+        <w:tc>
+          <w:tcPr>
+            <w:tcW w:type="dxa" w:w="2880"/>
+          </w:tcPr>
+          <w:p>
+            <w:r/>
+            <w:r>
+              <w:t>Poder restaurar respaldos viejos o corregidos a mano sin que la aplicación falle</w:t>
+            </w:r>
+          </w:p>
+        </w:tc>
+      </w:tr>
     </w:tbl>
     <w:p/>
     <w:p>

</xml_diff>

<commit_message>
Precarga del último ingeniero externo y empresa en MP externa y Reporte de Servicio (build 2026-06-17.50)
Derivado de la grabación de uso (build .49): el usuario registró varias MP
externas seguidas re-escribiendo cada vez el mismo ingeniero (Johans Herrera)
y empresa (Dräger). Igual que ya recuerda el último ejecutor y fecha, ahora
recuerda el último ingeniero externo + empresa y los precarga al elegir tipo
Externo (MP) o «Reporte de Servicio» (correctivo); se pueden cambiar.

La grabación confirmó además que IndexedDB y el ingeniero de texto libre
(build .49) funcionan: cero avisos de almacenamiento, nombre escrito sin
fricción. Grabación archivada; ENTENDIMIENTO.md/.docx actualizados.

Pruebas: precarga verde + suite completa (regresión, humo, motor, visita,
servicios externos, IndexedDB, robustez).
</commit_message>
<xml_diff>
--- a/ENTENDIMIENTO.docx
+++ b/ENTENDIMIENTO.docx
@@ -194,7 +194,7 @@
     </w:p>
     <w:p>
       <w:r>
-        <w:t>_Última actualización: 2026-06-16 · App build 2026-06-16.49_</w:t>
+        <w:t>_Última actualización: 2026-06-17 · App build 2026-06-17.50_</w:t>
       </w:r>
     </w:p>
     <w:p>
@@ -1092,7 +1092,32 @@
     </w:p>
     <w:p>
       <w:r>
-        <w:t>protocolo de mantenimiento externo). Esos datos viajan al pendiente del protocolo.</w:t>
+        <w:t>protocolo de mantenimiento externo). Esos datos viajan al pendiente del protocolo. La app</w:t>
+      </w:r>
+    </w:p>
+    <w:p>
+      <w:r>
+        <w:rPr>
+          <w:b/>
+        </w:rPr>
+        <w:t>recuerda el último ingeniero y empresa</w:t>
+      </w:r>
+      <w:r>
+        <w:t xml:space="preserve"> y los </w:t>
+      </w:r>
+      <w:r>
+        <w:rPr>
+          <w:b/>
+        </w:rPr>
+        <w:t>precarga</w:t>
+      </w:r>
+      <w:r>
+        <w:t xml:space="preserve"> en la siguiente MP externa (suelo</w:t>
+      </w:r>
+    </w:p>
+    <w:p>
+      <w:r>
+        <w:t>registrar varias seguidas con el mismo proveedor); se pueden cambiar.</w:t>
       </w:r>
     </w:p>
     <w:p>
@@ -4160,6 +4185,98 @@
           </w:p>
         </w:tc>
       </w:tr>
+      <w:tr>
+        <w:tc>
+          <w:tcPr>
+            <w:tcW w:type="dxa" w:w="2880"/>
+          </w:tcPr>
+          <w:p>
+            <w:r/>
+            <w:r>
+              <w:t>2026‑06‑17</w:t>
+            </w:r>
+          </w:p>
+        </w:tc>
+        <w:tc>
+          <w:tcPr>
+            <w:tcW w:type="dxa" w:w="2880"/>
+          </w:tcPr>
+          <w:p>
+            <w:r/>
+            <w:r>
+              <w:rPr>
+                <w:b/>
+              </w:rPr>
+              <w:t>Memoria del último ingeniero externo y empresa</w:t>
+            </w:r>
+            <w:r>
+              <w:t>: se precargan en la siguiente MP externa y en el Reporte de Servicio</w:t>
+            </w:r>
+          </w:p>
+        </w:tc>
+        <w:tc>
+          <w:tcPr>
+            <w:tcW w:type="dxa" w:w="2880"/>
+          </w:tcPr>
+          <w:p>
+            <w:r/>
+            <w:r>
+              <w:t>Registro varias MP externas seguidas con el mismo proveedor (p. ej. Johans Herrera · Dräger) y no quiero re‑escribirlo cada vez</w:t>
+            </w:r>
+          </w:p>
+        </w:tc>
+      </w:tr>
+      <w:tr>
+        <w:tc>
+          <w:tcPr>
+            <w:tcW w:type="dxa" w:w="2880"/>
+          </w:tcPr>
+          <w:p>
+            <w:r/>
+            <w:r>
+              <w:t>2026‑06‑17</w:t>
+            </w:r>
+          </w:p>
+        </w:tc>
+        <w:tc>
+          <w:tcPr>
+            <w:tcW w:type="dxa" w:w="2880"/>
+          </w:tcPr>
+          <w:p>
+            <w:r/>
+            <w:r>
+              <w:rPr>
+                <w:b/>
+              </w:rPr>
+              <w:t>Diagrama de flujo del programa</w:t>
+            </w:r>
+            <w:r>
+              <w:t xml:space="preserve"> (Sí/No) en </w:t>
+            </w:r>
+            <w:r>
+              <w:rPr>
+                <w:rFonts w:ascii="Consolas" w:hAnsi="Consolas"/>
+                <w:sz w:val="19"/>
+              </w:rPr>
+              <w:t>docs/</w:t>
+            </w:r>
+            <w:r>
+              <w:t xml:space="preserve"> (Mermaid + PNG + Markdown)</w:t>
+            </w:r>
+          </w:p>
+        </w:tc>
+        <w:tc>
+          <w:tcPr>
+            <w:tcW w:type="dxa" w:w="2880"/>
+          </w:tcPr>
+          <w:p>
+            <w:r/>
+            <w:r>
+              <w:t>Tener a la vista cómo decide el programa, para revisarlo y explicarlo</w:t>
+            </w:r>
+          </w:p>
+        </w:tc>
+      </w:tr>
     </w:tbl>
     <w:p/>
     <w:p>

</xml_diff>